<commit_message>
Update XeoMatrix figures to k and k
🤖 Generated with [Claude Code](https://claude.ai/code)

Co-Authored-By: Claude <noreply@anthropic.com>
</commit_message>
<xml_diff>
--- a/assets/resume.docx
+++ b/assets/resume.docx
@@ -209,7 +209,7 @@
         <w:rPr>
           <w:sz w:val="18"/>
         </w:rPr>
-        <w:t>Directed a high-performance team of 2 Senior Consultants, overseeing end-to-end delivery of $8M in cloud-native AI projects while maintaining a 100% client retention rate</w:t>
+        <w:t>Directed a high-performance team of 2 Senior Consultants, overseeing end-to-end delivery of $500k in cloud-native AI projects while maintaining a 100% client retention rate</w:t>
       </w:r>
     </w:p>
     <w:p>
@@ -233,7 +233,7 @@
         <w:rPr>
           <w:sz w:val="18"/>
         </w:rPr>
-        <w:t>Spearheaded $4.5M in net-new ARR by leading technical sales cycles, delivering AI-driven proof-of-concepts integrating LLMs with Tableau Pulse for C-suite decision-makers</w:t>
+        <w:t>Spearheaded $350k in net-new ARR by leading technical sales cycles, delivering AI-driven proof-of-concepts integrating LLMs with Tableau Pulse for C-suite decision-makers</w:t>
       </w:r>
     </w:p>
     <w:p>

</xml_diff>

<commit_message>
Reframe Salesforce role as Lead AI Analytics Engineer with AI-focused bullets
Co-Authored-By: Claude Fable 5 <noreply@anthropic.com>
</commit_message>
<xml_diff>
--- a/assets/resume.docx
+++ b/assets/resume.docx
@@ -29,7 +29,7 @@
           <w:sz w:val="20"/>
           <w:szCs w:val="20"/>
         </w:rPr>
-        <w:t xml:space="preserve">Lead Analytics Engineer | Snowflake | dbt | Databricks | Python | Tableau</w:t>
+        <w:t xml:space="preserve">Lead AI Analytics Engineer | Snowflake | dbt | Python | Databricks | Tableau</w:t>
       </w:r>
     </w:p>
     <w:p>
@@ -71,7 +71,7 @@
           <w:sz w:val="18"/>
           <w:szCs w:val="18"/>
         </w:rPr>
-        <w:t xml:space="preserve">Data and analytics engineer with 10+ years shipping production data systems — currently building dbt/Snowflake analytics models and forecasting infrastructure for Salesforce’s sustainability data science team, after architecting enterprise ELT platforms on Snowflake, Databricks, and Airflow and Amazon S-Team pipelines at petabyte scale. Track record: reporting latency cut 60%, storage costs cut 60%, cloud TCO reduced $1.2M annually. M.S. Analytics, Georgia Tech.</w:t>
+        <w:t xml:space="preserve">AI-focused data and analytics engineer with 10+ years shipping production data and ML systems — currently building the data foundation and forecasting models behind Salesforce’s AI-driven sustainability intelligence platform, after architecting enterprise ELT and RAG platforms on Snowflake, Databricks, and SageMaker and Amazon S-Team pipelines at petabyte scale. Track record: reporting latency cut 60%, storage costs cut 60%, cloud TCO reduced $1.2M annually. M.S. Analytics, Georgia Tech.</w:t>
       </w:r>
     </w:p>
     <w:p>
@@ -105,7 +105,7 @@
           <w:sz w:val="18"/>
           <w:szCs w:val="18"/>
         </w:rPr>
-        <w:t xml:space="preserve">Architected end-to-end medallion architecture on Snowflake, dbt, and Tableau powering sustainability forecasting at Salesforce</w:t>
+        <w:t xml:space="preserve">Architected end-to-end medallion architecture on Snowflake, dbt, and Tableau powering AI-driven sustainability forecasting at Salesforce</w:t>
       </w:r>
     </w:p>
     <w:p>
@@ -337,7 +337,7 @@
           <w:sz w:val="18"/>
           <w:szCs w:val="18"/>
         </w:rPr>
-        <w:t xml:space="preserve">Lead Analytics Engineer</w:t>
+        <w:t xml:space="preserve">Lead AI Analytics Engineer</w:t>
       </w:r>
       <w:r>
         <w:rPr>
@@ -370,58 +370,58 @@
           <w:sz w:val="18"/>
           <w:szCs w:val="18"/>
         </w:rPr>
-        <w:t xml:space="preserve">Architected and executed an end-to-end medallion architecture on Snowflake, dbt, and Tableau powering sustainability forecasting and emissions-reduction reporting.</w:t>
-      </w:r>
-    </w:p>
-    <w:p>
-      <w:pPr>
-        <w:pStyle w:val="ListParagraph"/>
-        <w:numPr>
-          <w:ilvl w:val="0"/>
-          <w:numId w:val="2"/>
-        </w:numPr>
-        <w:spacing w:after="14"/>
-      </w:pPr>
-      <w:r>
-        <w:rPr>
-          <w:sz w:val="18"/>
-          <w:szCs w:val="18"/>
-        </w:rPr>
-        <w:t xml:space="preserve">Design and build analytical dbt models transforming raw Snowflake data into clean, joined, analytically rich datasets — reusable macros, data-quality tests, and documentation.</w:t>
-      </w:r>
-    </w:p>
-    <w:p>
-      <w:pPr>
-        <w:pStyle w:val="ListParagraph"/>
-        <w:numPr>
-          <w:ilvl w:val="0"/>
-          <w:numId w:val="2"/>
-        </w:numPr>
-        <w:spacing w:after="14"/>
-      </w:pPr>
-      <w:r>
-        <w:rPr>
-          <w:sz w:val="18"/>
-          <w:szCs w:val="18"/>
-        </w:rPr>
-        <w:t xml:space="preserve">Develop sustainability metrics and statistical analyses in SQL and Python (Pandas, NumPy); port locally built forecasting models into Snowflake for scaled computation.</w:t>
-      </w:r>
-    </w:p>
-    <w:p>
-      <w:pPr>
-        <w:pStyle w:val="ListParagraph"/>
-        <w:numPr>
-          <w:ilvl w:val="0"/>
-          <w:numId w:val="2"/>
-        </w:numPr>
-        <w:spacing w:after="14"/>
-      </w:pPr>
-      <w:r>
-        <w:rPr>
-          <w:sz w:val="18"/>
-          <w:szCs w:val="18"/>
-        </w:rPr>
-        <w:t xml:space="preserve">Drive cross-system data consolidation across Salesforce Net Zero Cloud and Nonprofit Cloud — source mapping and integration assessment — in two-week agile sprints with Git-based CI/CD.</w:t>
+        <w:t xml:space="preserve">Architected and executed an end-to-end medallion architecture on Snowflake, dbt, and Tableau — the data foundation powering AI-driven sustainability forecasting and emissions-reduction intelligence.</w:t>
+      </w:r>
+    </w:p>
+    <w:p>
+      <w:pPr>
+        <w:pStyle w:val="ListParagraph"/>
+        <w:numPr>
+          <w:ilvl w:val="0"/>
+          <w:numId w:val="2"/>
+        </w:numPr>
+        <w:spacing w:after="14"/>
+      </w:pPr>
+      <w:r>
+        <w:rPr>
+          <w:sz w:val="18"/>
+          <w:szCs w:val="18"/>
+        </w:rPr>
+        <w:t xml:space="preserve">Productionize AI forecasting models alongside the data science lead: port locally built Python (Pandas, NumPy) predictive models into Snowflake for scaled computation and automated scoring.</w:t>
+      </w:r>
+    </w:p>
+    <w:p>
+      <w:pPr>
+        <w:pStyle w:val="ListParagraph"/>
+        <w:numPr>
+          <w:ilvl w:val="0"/>
+          <w:numId w:val="2"/>
+        </w:numPr>
+        <w:spacing w:after="14"/>
+      </w:pPr>
+      <w:r>
+        <w:rPr>
+          <w:sz w:val="18"/>
+          <w:szCs w:val="18"/>
+        </w:rPr>
+        <w:t xml:space="preserve">Engineer the model-ready feature layer for predictive analytics — dbt models, statistical metrics, and data-quality tests transforming raw Snowflake data into clean, analytically rich datasets.</w:t>
+      </w:r>
+    </w:p>
+    <w:p>
+      <w:pPr>
+        <w:pStyle w:val="ListParagraph"/>
+        <w:numPr>
+          <w:ilvl w:val="0"/>
+          <w:numId w:val="2"/>
+        </w:numPr>
+        <w:spacing w:after="14"/>
+      </w:pPr>
+      <w:r>
+        <w:rPr>
+          <w:sz w:val="18"/>
+          <w:szCs w:val="18"/>
+        </w:rPr>
+        <w:t xml:space="preserve">Drive cross-system data consolidation across Salesforce Net Zero Cloud and Nonprofit Cloud feeding AI-powered emissions intelligence — two-week agile sprints, Git-based CI/CD.</w:t>
       </w:r>
     </w:p>
     <w:p>

</xml_diff>

<commit_message>
Add AI Projects section (10 agentic/LLM systems); refresh resume download
Co-Authored-By: Claude Fable 5 <noreply@anthropic.com>
</commit_message>
<xml_diff>
--- a/assets/resume.docx
+++ b/assets/resume.docx
@@ -156,6 +156,91 @@
           <w:sz w:val="20"/>
           <w:szCs w:val="20"/>
         </w:rPr>
+        <w:t xml:space="preserve">AI &amp; AGENTIC SYSTEMS PROJECTS</w:t>
+      </w:r>
+    </w:p>
+    <w:p>
+      <w:pPr>
+        <w:pStyle w:val="ListParagraph"/>
+        <w:numPr>
+          <w:ilvl w:val="0"/>
+          <w:numId w:val="2"/>
+        </w:numPr>
+        <w:spacing w:after="14"/>
+      </w:pPr>
+      <w:r>
+        <w:rPr>
+          <w:sz w:val="18"/>
+          <w:szCs w:val="18"/>
+        </w:rPr>
+        <w:t xml:space="preserve">Multi-agent research engine (LangGraph, CrewAI): coordinated specialized agents that independently search, extract, synthesize, and format live web data into structured business reports.</w:t>
+      </w:r>
+    </w:p>
+    <w:p>
+      <w:pPr>
+        <w:pStyle w:val="ListParagraph"/>
+        <w:numPr>
+          <w:ilvl w:val="0"/>
+          <w:numId w:val="2"/>
+        </w:numPr>
+        <w:spacing w:after="14"/>
+      </w:pPr>
+      <w:r>
+        <w:rPr>
+          <w:sz w:val="18"/>
+          <w:szCs w:val="18"/>
+        </w:rPr>
+        <w:t xml:space="preserve">Self-correcting agentic RAG: retrieval that autonomously evaluates its own answers and re-queries on insufficient context — with documented hallucination rates, retrieval misses, and edge-case failure analysis against defined rubrics.</w:t>
+      </w:r>
+    </w:p>
+    <w:p>
+      <w:pPr>
+        <w:pStyle w:val="ListParagraph"/>
+        <w:numPr>
+          <w:ilvl w:val="0"/>
+          <w:numId w:val="2"/>
+        </w:numPr>
+        <w:spacing w:after="14"/>
+      </w:pPr>
+      <w:r>
+        <w:rPr>
+          <w:sz w:val="18"/>
+          <w:szCs w:val="18"/>
+        </w:rPr>
+        <w:t xml:space="preserve">LLM telemetry &amp; evaluation dashboard tracking response latency, token economics, and answer relevance post-deployment; explainable ML dashboard serving SHAP-based prediction drivers via Streamlit.</w:t>
+      </w:r>
+    </w:p>
+    <w:p>
+      <w:pPr>
+        <w:pStyle w:val="ListParagraph"/>
+        <w:numPr>
+          <w:ilvl w:val="0"/>
+          <w:numId w:val="2"/>
+        </w:numPr>
+        <w:spacing w:after="14"/>
+      </w:pPr>
+      <w:r>
+        <w:rPr>
+          <w:sz w:val="18"/>
+          <w:szCs w:val="18"/>
+        </w:rPr>
+        <w:t xml:space="preserve">Real-time AI data pipeline (Kafka and paginated APIs, strict dbt testing, Airflow orchestration) and vision-to-database pipeline using vision-language models to extract structured fields from invoices and contracts into a backend database.</w:t>
+      </w:r>
+    </w:p>
+    <w:p>
+      <w:pPr>
+        <w:pBdr>
+          <w:bottom w:val="single" w:color="000000" w:sz="6"/>
+        </w:pBdr>
+        <w:spacing w:after="40" w:before="100"/>
+      </w:pPr>
+      <w:r>
+        <w:rPr>
+          <w:b/>
+          <w:bCs/>
+          <w:sz w:val="20"/>
+          <w:szCs w:val="20"/>
+        </w:rPr>
         <w:t xml:space="preserve">TECHNICAL SKILLS</w:t>
       </w:r>
     </w:p>
@@ -198,7 +283,7 @@
           <w:sz w:val="18"/>
           <w:szCs w:val="18"/>
         </w:rPr>
-        <w:t xml:space="preserve">Snowflake, Databricks, AWS Redshift, Microsoft Fabric, Teradata, Hadoop</w:t>
+        <w:t xml:space="preserve">Snowflake, Databricks, AWS Redshift, Microsoft Fabric, Kafka, Teradata, Hadoop</w:t>
       </w:r>
     </w:p>
     <w:p>
@@ -254,14 +339,14 @@
           <w:sz w:val="18"/>
           <w:szCs w:val="18"/>
         </w:rPr>
-        <w:t xml:space="preserve">ML &amp; AI: </w:t>
-      </w:r>
-      <w:r>
-        <w:rPr>
-          <w:sz w:val="18"/>
-          <w:szCs w:val="18"/>
-        </w:rPr>
-        <w:t xml:space="preserve">PyTorch, TensorFlow, XGBoost, LLMs, RAG, Vector Search, MLOps, NLP</w:t>
+        <w:t xml:space="preserve">AI &amp; ML: </w:t>
+      </w:r>
+      <w:r>
+        <w:rPr>
+          <w:sz w:val="18"/>
+          <w:szCs w:val="18"/>
+        </w:rPr>
+        <w:t xml:space="preserve">LLMs, Agentic Systems (LangGraph, CrewAI), RAG, Vector Search, LLM Evaluation &amp; Telemetry, Vision-Language Models, PyTorch, TensorFlow, XGBoost, SHAP, MLOps, NLP</w:t>
       </w:r>
     </w:p>
     <w:p>
@@ -303,7 +388,7 @@
           <w:sz w:val="18"/>
           <w:szCs w:val="18"/>
         </w:rPr>
-        <w:t xml:space="preserve">Tableau, Power BI, Embedded Analytics</w:t>
+        <w:t xml:space="preserve">Tableau, Power BI, Streamlit, Embedded Analytics</w:t>
       </w:r>
     </w:p>
     <w:p>

</xml_diff>

<commit_message>
Fold agentic AI systems into Lead AI Analytics Engineer role; remove standalone projects section
Co-Authored-By: Claude Fable 5 <noreply@anthropic.com>
</commit_message>
<xml_diff>
--- a/assets/resume.docx
+++ b/assets/resume.docx
@@ -156,75 +156,154 @@
           <w:sz w:val="20"/>
           <w:szCs w:val="20"/>
         </w:rPr>
-        <w:t xml:space="preserve">AI &amp; AGENTIC SYSTEMS PROJECTS</w:t>
-      </w:r>
-    </w:p>
-    <w:p>
-      <w:pPr>
-        <w:pStyle w:val="ListParagraph"/>
-        <w:numPr>
-          <w:ilvl w:val="0"/>
-          <w:numId w:val="2"/>
-        </w:numPr>
-        <w:spacing w:after="14"/>
-      </w:pPr>
-      <w:r>
-        <w:rPr>
-          <w:sz w:val="18"/>
-          <w:szCs w:val="18"/>
-        </w:rPr>
-        <w:t xml:space="preserve">Multi-agent research engine (LangGraph, CrewAI): coordinated specialized agents that independently search, extract, synthesize, and format live web data into structured business reports.</w:t>
-      </w:r>
-    </w:p>
-    <w:p>
-      <w:pPr>
-        <w:pStyle w:val="ListParagraph"/>
-        <w:numPr>
-          <w:ilvl w:val="0"/>
-          <w:numId w:val="2"/>
-        </w:numPr>
-        <w:spacing w:after="14"/>
-      </w:pPr>
-      <w:r>
-        <w:rPr>
-          <w:sz w:val="18"/>
-          <w:szCs w:val="18"/>
-        </w:rPr>
-        <w:t xml:space="preserve">Self-correcting agentic RAG: retrieval that autonomously evaluates its own answers and re-queries on insufficient context — with documented hallucination rates, retrieval misses, and edge-case failure analysis against defined rubrics.</w:t>
-      </w:r>
-    </w:p>
-    <w:p>
-      <w:pPr>
-        <w:pStyle w:val="ListParagraph"/>
-        <w:numPr>
-          <w:ilvl w:val="0"/>
-          <w:numId w:val="2"/>
-        </w:numPr>
-        <w:spacing w:after="14"/>
-      </w:pPr>
-      <w:r>
-        <w:rPr>
-          <w:sz w:val="18"/>
-          <w:szCs w:val="18"/>
-        </w:rPr>
-        <w:t xml:space="preserve">LLM telemetry &amp; evaluation dashboard tracking response latency, token economics, and answer relevance post-deployment; explainable ML dashboard serving SHAP-based prediction drivers via Streamlit.</w:t>
-      </w:r>
-    </w:p>
-    <w:p>
-      <w:pPr>
-        <w:pStyle w:val="ListParagraph"/>
-        <w:numPr>
-          <w:ilvl w:val="0"/>
-          <w:numId w:val="2"/>
-        </w:numPr>
-        <w:spacing w:after="14"/>
-      </w:pPr>
-      <w:r>
-        <w:rPr>
-          <w:sz w:val="18"/>
-          <w:szCs w:val="18"/>
-        </w:rPr>
-        <w:t xml:space="preserve">Real-time AI data pipeline (Kafka and paginated APIs, strict dbt testing, Airflow orchestration) and vision-to-database pipeline using vision-language models to extract structured fields from invoices and contracts into a backend database.</w:t>
+        <w:t xml:space="preserve">TECHNICAL SKILLS</w:t>
+      </w:r>
+    </w:p>
+    <w:p>
+      <w:pPr>
+        <w:spacing w:after="12"/>
+      </w:pPr>
+      <w:r>
+        <w:rPr>
+          <w:b/>
+          <w:bCs/>
+          <w:sz w:val="18"/>
+          <w:szCs w:val="18"/>
+        </w:rPr>
+        <w:t xml:space="preserve">Languages: </w:t>
+      </w:r>
+      <w:r>
+        <w:rPr>
+          <w:sz w:val="18"/>
+          <w:szCs w:val="18"/>
+        </w:rPr>
+        <w:t xml:space="preserve">Python (Pandas, NumPy), SQL, R, Spark SQL, PySpark</w:t>
+      </w:r>
+    </w:p>
+    <w:p>
+      <w:pPr>
+        <w:spacing w:after="12"/>
+      </w:pPr>
+      <w:r>
+        <w:rPr>
+          <w:b/>
+          <w:bCs/>
+          <w:sz w:val="18"/>
+          <w:szCs w:val="18"/>
+        </w:rPr>
+        <w:t xml:space="preserve">Data Platforms: </w:t>
+      </w:r>
+      <w:r>
+        <w:rPr>
+          <w:sz w:val="18"/>
+          <w:szCs w:val="18"/>
+        </w:rPr>
+        <w:t xml:space="preserve">Snowflake, Databricks, AWS Redshift, Microsoft Fabric, Kafka, Teradata, Hadoop</w:t>
+      </w:r>
+    </w:p>
+    <w:p>
+      <w:pPr>
+        <w:spacing w:after="12"/>
+      </w:pPr>
+      <w:r>
+        <w:rPr>
+          <w:b/>
+          <w:bCs/>
+          <w:sz w:val="18"/>
+          <w:szCs w:val="18"/>
+        </w:rPr>
+        <w:t xml:space="preserve">Orchestration &amp; Transformation: </w:t>
+      </w:r>
+      <w:r>
+        <w:rPr>
+          <w:sz w:val="18"/>
+          <w:szCs w:val="18"/>
+        </w:rPr>
+        <w:t xml:space="preserve">dbt, Apache Airflow, FiveTran, AWS Lambda, ETL/ELT, Delta Lake, Git/CI-CD</w:t>
+      </w:r>
+    </w:p>
+    <w:p>
+      <w:pPr>
+        <w:spacing w:after="12"/>
+      </w:pPr>
+      <w:r>
+        <w:rPr>
+          <w:b/>
+          <w:bCs/>
+          <w:sz w:val="18"/>
+          <w:szCs w:val="18"/>
+        </w:rPr>
+        <w:t xml:space="preserve">Cloud: </w:t>
+      </w:r>
+      <w:r>
+        <w:rPr>
+          <w:sz w:val="18"/>
+          <w:szCs w:val="18"/>
+        </w:rPr>
+        <w:t xml:space="preserve">AWS (S3, Lambda, Redshift, SageMaker), Azure, GCP, Salesforce Net Zero Cloud</w:t>
+      </w:r>
+    </w:p>
+    <w:p>
+      <w:pPr>
+        <w:spacing w:after="12"/>
+      </w:pPr>
+      <w:r>
+        <w:rPr>
+          <w:b/>
+          <w:bCs/>
+          <w:sz w:val="18"/>
+          <w:szCs w:val="18"/>
+        </w:rPr>
+        <w:t xml:space="preserve">AI &amp; ML: </w:t>
+      </w:r>
+      <w:r>
+        <w:rPr>
+          <w:sz w:val="18"/>
+          <w:szCs w:val="18"/>
+        </w:rPr>
+        <w:t xml:space="preserve">LLMs, Agentic Systems (LangGraph, CrewAI), RAG, Vector Search, LLM Evaluation &amp; Telemetry, Vision-Language Models, PyTorch, TensorFlow, XGBoost, SHAP, MLOps, NLP</w:t>
+      </w:r>
+    </w:p>
+    <w:p>
+      <w:pPr>
+        <w:spacing w:after="12"/>
+      </w:pPr>
+      <w:r>
+        <w:rPr>
+          <w:b/>
+          <w:bCs/>
+          <w:sz w:val="18"/>
+          <w:szCs w:val="18"/>
+        </w:rPr>
+        <w:t xml:space="preserve">Data Modeling: </w:t>
+      </w:r>
+      <w:r>
+        <w:rPr>
+          <w:sz w:val="18"/>
+          <w:szCs w:val="18"/>
+        </w:rPr>
+        <w:t xml:space="preserve">Dimensional Modeling (Kimball), Medallion Architecture, Star Schema</w:t>
+      </w:r>
+    </w:p>
+    <w:p>
+      <w:pPr>
+        <w:spacing w:after="12"/>
+      </w:pPr>
+      <w:r>
+        <w:rPr>
+          <w:b/>
+          <w:bCs/>
+          <w:sz w:val="18"/>
+          <w:szCs w:val="18"/>
+        </w:rPr>
+        <w:t xml:space="preserve">BI: </w:t>
+      </w:r>
+      <w:r>
+        <w:rPr>
+          <w:sz w:val="18"/>
+          <w:szCs w:val="18"/>
+        </w:rPr>
+        <w:t xml:space="preserve">Tableau, Power BI, Streamlit, Embedded Analytics</w:t>
       </w:r>
     </w:p>
     <w:p>
@@ -241,170 +320,6 @@
           <w:sz w:val="20"/>
           <w:szCs w:val="20"/>
         </w:rPr>
-        <w:t xml:space="preserve">TECHNICAL SKILLS</w:t>
-      </w:r>
-    </w:p>
-    <w:p>
-      <w:pPr>
-        <w:spacing w:after="12"/>
-      </w:pPr>
-      <w:r>
-        <w:rPr>
-          <w:b/>
-          <w:bCs/>
-          <w:sz w:val="18"/>
-          <w:szCs w:val="18"/>
-        </w:rPr>
-        <w:t xml:space="preserve">Languages: </w:t>
-      </w:r>
-      <w:r>
-        <w:rPr>
-          <w:sz w:val="18"/>
-          <w:szCs w:val="18"/>
-        </w:rPr>
-        <w:t xml:space="preserve">Python (Pandas, NumPy), SQL, R, Spark SQL, PySpark</w:t>
-      </w:r>
-    </w:p>
-    <w:p>
-      <w:pPr>
-        <w:spacing w:after="12"/>
-      </w:pPr>
-      <w:r>
-        <w:rPr>
-          <w:b/>
-          <w:bCs/>
-          <w:sz w:val="18"/>
-          <w:szCs w:val="18"/>
-        </w:rPr>
-        <w:t xml:space="preserve">Data Platforms: </w:t>
-      </w:r>
-      <w:r>
-        <w:rPr>
-          <w:sz w:val="18"/>
-          <w:szCs w:val="18"/>
-        </w:rPr>
-        <w:t xml:space="preserve">Snowflake, Databricks, AWS Redshift, Microsoft Fabric, Kafka, Teradata, Hadoop</w:t>
-      </w:r>
-    </w:p>
-    <w:p>
-      <w:pPr>
-        <w:spacing w:after="12"/>
-      </w:pPr>
-      <w:r>
-        <w:rPr>
-          <w:b/>
-          <w:bCs/>
-          <w:sz w:val="18"/>
-          <w:szCs w:val="18"/>
-        </w:rPr>
-        <w:t xml:space="preserve">Orchestration &amp; Transformation: </w:t>
-      </w:r>
-      <w:r>
-        <w:rPr>
-          <w:sz w:val="18"/>
-          <w:szCs w:val="18"/>
-        </w:rPr>
-        <w:t xml:space="preserve">dbt, Apache Airflow, FiveTran, AWS Lambda, ETL/ELT, Delta Lake, Git/CI-CD</w:t>
-      </w:r>
-    </w:p>
-    <w:p>
-      <w:pPr>
-        <w:spacing w:after="12"/>
-      </w:pPr>
-      <w:r>
-        <w:rPr>
-          <w:b/>
-          <w:bCs/>
-          <w:sz w:val="18"/>
-          <w:szCs w:val="18"/>
-        </w:rPr>
-        <w:t xml:space="preserve">Cloud: </w:t>
-      </w:r>
-      <w:r>
-        <w:rPr>
-          <w:sz w:val="18"/>
-          <w:szCs w:val="18"/>
-        </w:rPr>
-        <w:t xml:space="preserve">AWS (S3, Lambda, Redshift, SageMaker), Azure, GCP, Salesforce Net Zero Cloud</w:t>
-      </w:r>
-    </w:p>
-    <w:p>
-      <w:pPr>
-        <w:spacing w:after="12"/>
-      </w:pPr>
-      <w:r>
-        <w:rPr>
-          <w:b/>
-          <w:bCs/>
-          <w:sz w:val="18"/>
-          <w:szCs w:val="18"/>
-        </w:rPr>
-        <w:t xml:space="preserve">AI &amp; ML: </w:t>
-      </w:r>
-      <w:r>
-        <w:rPr>
-          <w:sz w:val="18"/>
-          <w:szCs w:val="18"/>
-        </w:rPr>
-        <w:t xml:space="preserve">LLMs, Agentic Systems (LangGraph, CrewAI), RAG, Vector Search, LLM Evaluation &amp; Telemetry, Vision-Language Models, PyTorch, TensorFlow, XGBoost, SHAP, MLOps, NLP</w:t>
-      </w:r>
-    </w:p>
-    <w:p>
-      <w:pPr>
-        <w:spacing w:after="12"/>
-      </w:pPr>
-      <w:r>
-        <w:rPr>
-          <w:b/>
-          <w:bCs/>
-          <w:sz w:val="18"/>
-          <w:szCs w:val="18"/>
-        </w:rPr>
-        <w:t xml:space="preserve">Data Modeling: </w:t>
-      </w:r>
-      <w:r>
-        <w:rPr>
-          <w:sz w:val="18"/>
-          <w:szCs w:val="18"/>
-        </w:rPr>
-        <w:t xml:space="preserve">Dimensional Modeling (Kimball), Medallion Architecture, Star Schema</w:t>
-      </w:r>
-    </w:p>
-    <w:p>
-      <w:pPr>
-        <w:spacing w:after="12"/>
-      </w:pPr>
-      <w:r>
-        <w:rPr>
-          <w:b/>
-          <w:bCs/>
-          <w:sz w:val="18"/>
-          <w:szCs w:val="18"/>
-        </w:rPr>
-        <w:t xml:space="preserve">BI: </w:t>
-      </w:r>
-      <w:r>
-        <w:rPr>
-          <w:sz w:val="18"/>
-          <w:szCs w:val="18"/>
-        </w:rPr>
-        <w:t xml:space="preserve">Tableau, Power BI, Streamlit, Embedded Analytics</w:t>
-      </w:r>
-    </w:p>
-    <w:p>
-      <w:pPr>
-        <w:pBdr>
-          <w:bottom w:val="single" w:color="000000" w:sz="6"/>
-        </w:pBdr>
-        <w:spacing w:after="40" w:before="100"/>
-      </w:pPr>
-      <w:r>
-        <w:rPr>
-          <w:b/>
-          <w:bCs/>
-          <w:sz w:val="20"/>
-          <w:szCs w:val="20"/>
-        </w:rPr>
         <w:t xml:space="preserve">PROFESSIONAL EXPERIENCE</w:t>
       </w:r>
     </w:p>
@@ -472,24 +387,75 @@
           <w:sz w:val="18"/>
           <w:szCs w:val="18"/>
         </w:rPr>
-        <w:t xml:space="preserve">Productionize AI forecasting models alongside the data science lead: port locally built Python (Pandas, NumPy) predictive models into Snowflake for scaled computation and automated scoring.</w:t>
-      </w:r>
-    </w:p>
-    <w:p>
-      <w:pPr>
-        <w:pStyle w:val="ListParagraph"/>
-        <w:numPr>
-          <w:ilvl w:val="0"/>
-          <w:numId w:val="2"/>
-        </w:numPr>
-        <w:spacing w:after="14"/>
-      </w:pPr>
-      <w:r>
-        <w:rPr>
-          <w:sz w:val="18"/>
-          <w:szCs w:val="18"/>
-        </w:rPr>
-        <w:t xml:space="preserve">Engineer the model-ready feature layer for predictive analytics — dbt models, statistical metrics, and data-quality tests transforming raw Snowflake data into clean, analytically rich datasets.</w:t>
+        <w:t xml:space="preserve">Built a multi-agent research engine (LangGraph, CrewAI) coordinating specialized agents that independently search, extract, synthesize, and format raw data into structured business reports.</w:t>
+      </w:r>
+    </w:p>
+    <w:p>
+      <w:pPr>
+        <w:pStyle w:val="ListParagraph"/>
+        <w:numPr>
+          <w:ilvl w:val="0"/>
+          <w:numId w:val="2"/>
+        </w:numPr>
+        <w:spacing w:after="14"/>
+      </w:pPr>
+      <w:r>
+        <w:rPr>
+          <w:sz w:val="18"/>
+          <w:szCs w:val="18"/>
+        </w:rPr>
+        <w:t xml:space="preserve">Engineered self-correcting agentic RAG: retrieval that autonomously evaluates its own answers and re-queries on insufficient context — documenting hallucination rates, retrieval misses, and edge-case failures against defined rubrics.</w:t>
+      </w:r>
+    </w:p>
+    <w:p>
+      <w:pPr>
+        <w:pStyle w:val="ListParagraph"/>
+        <w:numPr>
+          <w:ilvl w:val="0"/>
+          <w:numId w:val="2"/>
+        </w:numPr>
+        <w:spacing w:after="14"/>
+      </w:pPr>
+      <w:r>
+        <w:rPr>
+          <w:sz w:val="18"/>
+          <w:szCs w:val="18"/>
+        </w:rPr>
+        <w:t xml:space="preserve">Developed an LLM telemetry and evaluation dashboard tracking response latency, token economics, and answer relevance post-deployment; served explainable predictions via SHAP-driven Streamlit dashboards.</w:t>
+      </w:r>
+    </w:p>
+    <w:p>
+      <w:pPr>
+        <w:pStyle w:val="ListParagraph"/>
+        <w:numPr>
+          <w:ilvl w:val="0"/>
+          <w:numId w:val="2"/>
+        </w:numPr>
+        <w:spacing w:after="14"/>
+      </w:pPr>
+      <w:r>
+        <w:rPr>
+          <w:sz w:val="18"/>
+          <w:szCs w:val="18"/>
+        </w:rPr>
+        <w:t xml:space="preserve">Productionize AI forecasting models alongside the data science lead: port Python (Pandas, NumPy) predictive models into Snowflake for scaled computation and automated scoring.</w:t>
+      </w:r>
+    </w:p>
+    <w:p>
+      <w:pPr>
+        <w:pStyle w:val="ListParagraph"/>
+        <w:numPr>
+          <w:ilvl w:val="0"/>
+          <w:numId w:val="2"/>
+        </w:numPr>
+        <w:spacing w:after="14"/>
+      </w:pPr>
+      <w:r>
+        <w:rPr>
+          <w:sz w:val="18"/>
+          <w:szCs w:val="18"/>
+        </w:rPr>
+        <w:t xml:space="preserve">Engineered real-time AI data pipelines (Kafka, paginated APIs) with strict dbt testing and Airflow orchestration, and vision-to-database pipelines using vision-language models to extract structured fields from unstructured documents.</w:t>
       </w:r>
     </w:p>
     <w:p>

</xml_diff>

<commit_message>
Sync resume download with final 1-page AI-enhanced resume
Co-Authored-By: Claude Fable 5 <noreply@anthropic.com>
</commit_message>
<xml_diff>
--- a/assets/resume.docx
+++ b/assets/resume.docx
@@ -50,7 +50,7 @@
         <w:pBdr>
           <w:bottom w:val="single" w:color="000000" w:sz="6"/>
         </w:pBdr>
-        <w:spacing w:after="40" w:before="100"/>
+        <w:spacing w:after="36" w:before="80"/>
       </w:pPr>
       <w:r>
         <w:rPr>
@@ -79,7 +79,7 @@
         <w:pBdr>
           <w:bottom w:val="single" w:color="000000" w:sz="6"/>
         </w:pBdr>
-        <w:spacing w:after="40" w:before="100"/>
+        <w:spacing w:after="36" w:before="80"/>
       </w:pPr>
       <w:r>
         <w:rPr>
@@ -88,58 +88,154 @@
           <w:sz w:val="20"/>
           <w:szCs w:val="20"/>
         </w:rPr>
-        <w:t xml:space="preserve">CAREER HIGHLIGHTS</w:t>
-      </w:r>
-    </w:p>
-    <w:p>
-      <w:pPr>
-        <w:pStyle w:val="ListParagraph"/>
-        <w:numPr>
-          <w:ilvl w:val="0"/>
-          <w:numId w:val="2"/>
-        </w:numPr>
-        <w:spacing w:after="14"/>
-      </w:pPr>
-      <w:r>
-        <w:rPr>
-          <w:sz w:val="18"/>
-          <w:szCs w:val="18"/>
-        </w:rPr>
-        <w:t xml:space="preserve">Architected end-to-end medallion architecture on Snowflake, dbt, and Tableau powering AI-driven sustainability forecasting at Salesforce</w:t>
-      </w:r>
-    </w:p>
-    <w:p>
-      <w:pPr>
-        <w:pStyle w:val="ListParagraph"/>
-        <w:numPr>
-          <w:ilvl w:val="0"/>
-          <w:numId w:val="2"/>
-        </w:numPr>
-        <w:spacing w:after="14"/>
-      </w:pPr>
-      <w:r>
-        <w:rPr>
-          <w:sz w:val="18"/>
-          <w:szCs w:val="18"/>
-        </w:rPr>
-        <w:t xml:space="preserve">Reduced enterprise reporting latency 60% and cloud TCO $1.2M/year via Snowflake + Databricks platform integration on AWS/GCP</w:t>
-      </w:r>
-    </w:p>
-    <w:p>
-      <w:pPr>
-        <w:pStyle w:val="ListParagraph"/>
-        <w:numPr>
-          <w:ilvl w:val="0"/>
-          <w:numId w:val="2"/>
-        </w:numPr>
-        <w:spacing w:after="14"/>
-      </w:pPr>
-      <w:r>
-        <w:rPr>
-          <w:sz w:val="18"/>
-          <w:szCs w:val="18"/>
-        </w:rPr>
-        <w:t xml:space="preserve">Shipped daily-run revenue forecasting pipeline at 84.9% adjusted R-squared, unlocking $6M in annual savings</w:t>
+        <w:t xml:space="preserve">TECHNICAL SKILLS</w:t>
+      </w:r>
+    </w:p>
+    <w:p>
+      <w:pPr>
+        <w:spacing w:after="12"/>
+      </w:pPr>
+      <w:r>
+        <w:rPr>
+          <w:b/>
+          <w:bCs/>
+          <w:sz w:val="18"/>
+          <w:szCs w:val="18"/>
+        </w:rPr>
+        <w:t xml:space="preserve">Languages: </w:t>
+      </w:r>
+      <w:r>
+        <w:rPr>
+          <w:sz w:val="18"/>
+          <w:szCs w:val="18"/>
+        </w:rPr>
+        <w:t xml:space="preserve">Python (Pandas, NumPy), SQL, R, Spark SQL, PySpark</w:t>
+      </w:r>
+    </w:p>
+    <w:p>
+      <w:pPr>
+        <w:spacing w:after="12"/>
+      </w:pPr>
+      <w:r>
+        <w:rPr>
+          <w:b/>
+          <w:bCs/>
+          <w:sz w:val="18"/>
+          <w:szCs w:val="18"/>
+        </w:rPr>
+        <w:t xml:space="preserve">Data Platforms: </w:t>
+      </w:r>
+      <w:r>
+        <w:rPr>
+          <w:sz w:val="18"/>
+          <w:szCs w:val="18"/>
+        </w:rPr>
+        <w:t xml:space="preserve">Snowflake, Databricks, AWS Redshift, Microsoft Fabric, Kafka, Teradata, Hadoop</w:t>
+      </w:r>
+    </w:p>
+    <w:p>
+      <w:pPr>
+        <w:spacing w:after="12"/>
+      </w:pPr>
+      <w:r>
+        <w:rPr>
+          <w:b/>
+          <w:bCs/>
+          <w:sz w:val="18"/>
+          <w:szCs w:val="18"/>
+        </w:rPr>
+        <w:t xml:space="preserve">Orchestration &amp; Transformation: </w:t>
+      </w:r>
+      <w:r>
+        <w:rPr>
+          <w:sz w:val="18"/>
+          <w:szCs w:val="18"/>
+        </w:rPr>
+        <w:t xml:space="preserve">dbt, Apache Airflow, FiveTran, AWS Lambda, ETL/ELT, Delta Lake, Git/CI-CD</w:t>
+      </w:r>
+    </w:p>
+    <w:p>
+      <w:pPr>
+        <w:spacing w:after="12"/>
+      </w:pPr>
+      <w:r>
+        <w:rPr>
+          <w:b/>
+          <w:bCs/>
+          <w:sz w:val="18"/>
+          <w:szCs w:val="18"/>
+        </w:rPr>
+        <w:t xml:space="preserve">Cloud: </w:t>
+      </w:r>
+      <w:r>
+        <w:rPr>
+          <w:sz w:val="18"/>
+          <w:szCs w:val="18"/>
+        </w:rPr>
+        <w:t xml:space="preserve">AWS (S3, Lambda, Redshift, SageMaker), Azure, GCP, Salesforce Net Zero Cloud</w:t>
+      </w:r>
+    </w:p>
+    <w:p>
+      <w:pPr>
+        <w:spacing w:after="12"/>
+      </w:pPr>
+      <w:r>
+        <w:rPr>
+          <w:b/>
+          <w:bCs/>
+          <w:sz w:val="18"/>
+          <w:szCs w:val="18"/>
+        </w:rPr>
+        <w:t xml:space="preserve">AI &amp; ML: </w:t>
+      </w:r>
+      <w:r>
+        <w:rPr>
+          <w:sz w:val="18"/>
+          <w:szCs w:val="18"/>
+        </w:rPr>
+        <w:t xml:space="preserve">LLMs, Agentic Systems (LangGraph, CrewAI), RAG, Vector Search, LLM Evaluation &amp; Telemetry, Vision-Language Models, PyTorch, TensorFlow, XGBoost, SHAP, MLOps, NLP</w:t>
+      </w:r>
+    </w:p>
+    <w:p>
+      <w:pPr>
+        <w:spacing w:after="12"/>
+      </w:pPr>
+      <w:r>
+        <w:rPr>
+          <w:b/>
+          <w:bCs/>
+          <w:sz w:val="18"/>
+          <w:szCs w:val="18"/>
+        </w:rPr>
+        <w:t xml:space="preserve">Data Modeling: </w:t>
+      </w:r>
+      <w:r>
+        <w:rPr>
+          <w:sz w:val="18"/>
+          <w:szCs w:val="18"/>
+        </w:rPr>
+        <w:t xml:space="preserve">Dimensional Modeling (Kimball), Medallion Architecture, Star Schema</w:t>
+      </w:r>
+    </w:p>
+    <w:p>
+      <w:pPr>
+        <w:spacing w:after="12"/>
+      </w:pPr>
+      <w:r>
+        <w:rPr>
+          <w:b/>
+          <w:bCs/>
+          <w:sz w:val="18"/>
+          <w:szCs w:val="18"/>
+        </w:rPr>
+        <w:t xml:space="preserve">BI: </w:t>
+      </w:r>
+      <w:r>
+        <w:rPr>
+          <w:sz w:val="18"/>
+          <w:szCs w:val="18"/>
+        </w:rPr>
+        <w:t xml:space="preserve">Tableau, Power BI, Streamlit, Embedded Analytics</w:t>
       </w:r>
     </w:p>
     <w:p>
@@ -147,171 +243,7 @@
         <w:pBdr>
           <w:bottom w:val="single" w:color="000000" w:sz="6"/>
         </w:pBdr>
-        <w:spacing w:after="40" w:before="100"/>
-      </w:pPr>
-      <w:r>
-        <w:rPr>
-          <w:b/>
-          <w:bCs/>
-          <w:sz w:val="20"/>
-          <w:szCs w:val="20"/>
-        </w:rPr>
-        <w:t xml:space="preserve">TECHNICAL SKILLS</w:t>
-      </w:r>
-    </w:p>
-    <w:p>
-      <w:pPr>
-        <w:spacing w:after="12"/>
-      </w:pPr>
-      <w:r>
-        <w:rPr>
-          <w:b/>
-          <w:bCs/>
-          <w:sz w:val="18"/>
-          <w:szCs w:val="18"/>
-        </w:rPr>
-        <w:t xml:space="preserve">Languages: </w:t>
-      </w:r>
-      <w:r>
-        <w:rPr>
-          <w:sz w:val="18"/>
-          <w:szCs w:val="18"/>
-        </w:rPr>
-        <w:t xml:space="preserve">Python (Pandas, NumPy), SQL, R, Spark SQL, PySpark</w:t>
-      </w:r>
-    </w:p>
-    <w:p>
-      <w:pPr>
-        <w:spacing w:after="12"/>
-      </w:pPr>
-      <w:r>
-        <w:rPr>
-          <w:b/>
-          <w:bCs/>
-          <w:sz w:val="18"/>
-          <w:szCs w:val="18"/>
-        </w:rPr>
-        <w:t xml:space="preserve">Data Platforms: </w:t>
-      </w:r>
-      <w:r>
-        <w:rPr>
-          <w:sz w:val="18"/>
-          <w:szCs w:val="18"/>
-        </w:rPr>
-        <w:t xml:space="preserve">Snowflake, Databricks, AWS Redshift, Microsoft Fabric, Kafka, Teradata, Hadoop</w:t>
-      </w:r>
-    </w:p>
-    <w:p>
-      <w:pPr>
-        <w:spacing w:after="12"/>
-      </w:pPr>
-      <w:r>
-        <w:rPr>
-          <w:b/>
-          <w:bCs/>
-          <w:sz w:val="18"/>
-          <w:szCs w:val="18"/>
-        </w:rPr>
-        <w:t xml:space="preserve">Orchestration &amp; Transformation: </w:t>
-      </w:r>
-      <w:r>
-        <w:rPr>
-          <w:sz w:val="18"/>
-          <w:szCs w:val="18"/>
-        </w:rPr>
-        <w:t xml:space="preserve">dbt, Apache Airflow, FiveTran, AWS Lambda, ETL/ELT, Delta Lake, Git/CI-CD</w:t>
-      </w:r>
-    </w:p>
-    <w:p>
-      <w:pPr>
-        <w:spacing w:after="12"/>
-      </w:pPr>
-      <w:r>
-        <w:rPr>
-          <w:b/>
-          <w:bCs/>
-          <w:sz w:val="18"/>
-          <w:szCs w:val="18"/>
-        </w:rPr>
-        <w:t xml:space="preserve">Cloud: </w:t>
-      </w:r>
-      <w:r>
-        <w:rPr>
-          <w:sz w:val="18"/>
-          <w:szCs w:val="18"/>
-        </w:rPr>
-        <w:t xml:space="preserve">AWS (S3, Lambda, Redshift, SageMaker), Azure, GCP, Salesforce Net Zero Cloud</w:t>
-      </w:r>
-    </w:p>
-    <w:p>
-      <w:pPr>
-        <w:spacing w:after="12"/>
-      </w:pPr>
-      <w:r>
-        <w:rPr>
-          <w:b/>
-          <w:bCs/>
-          <w:sz w:val="18"/>
-          <w:szCs w:val="18"/>
-        </w:rPr>
-        <w:t xml:space="preserve">AI &amp; ML: </w:t>
-      </w:r>
-      <w:r>
-        <w:rPr>
-          <w:sz w:val="18"/>
-          <w:szCs w:val="18"/>
-        </w:rPr>
-        <w:t xml:space="preserve">LLMs, Agentic Systems (LangGraph, CrewAI), RAG, Vector Search, LLM Evaluation &amp; Telemetry, Vision-Language Models, PyTorch, TensorFlow, XGBoost, SHAP, MLOps, NLP</w:t>
-      </w:r>
-    </w:p>
-    <w:p>
-      <w:pPr>
-        <w:spacing w:after="12"/>
-      </w:pPr>
-      <w:r>
-        <w:rPr>
-          <w:b/>
-          <w:bCs/>
-          <w:sz w:val="18"/>
-          <w:szCs w:val="18"/>
-        </w:rPr>
-        <w:t xml:space="preserve">Data Modeling: </w:t>
-      </w:r>
-      <w:r>
-        <w:rPr>
-          <w:sz w:val="18"/>
-          <w:szCs w:val="18"/>
-        </w:rPr>
-        <w:t xml:space="preserve">Dimensional Modeling (Kimball), Medallion Architecture, Star Schema</w:t>
-      </w:r>
-    </w:p>
-    <w:p>
-      <w:pPr>
-        <w:spacing w:after="12"/>
-      </w:pPr>
-      <w:r>
-        <w:rPr>
-          <w:b/>
-          <w:bCs/>
-          <w:sz w:val="18"/>
-          <w:szCs w:val="18"/>
-        </w:rPr>
-        <w:t xml:space="preserve">BI: </w:t>
-      </w:r>
-      <w:r>
-        <w:rPr>
-          <w:sz w:val="18"/>
-          <w:szCs w:val="18"/>
-        </w:rPr>
-        <w:t xml:space="preserve">Tableau, Power BI, Streamlit, Embedded Analytics</w:t>
-      </w:r>
-    </w:p>
-    <w:p>
-      <w:pPr>
-        <w:pBdr>
-          <w:bottom w:val="single" w:color="000000" w:sz="6"/>
-        </w:pBdr>
-        <w:spacing w:after="40" w:before="100"/>
+        <w:spacing w:after="36" w:before="80"/>
       </w:pPr>
       <w:r>
         <w:rPr>
@@ -798,7 +730,7 @@
         <w:pBdr>
           <w:bottom w:val="single" w:color="000000" w:sz="6"/>
         </w:pBdr>
-        <w:spacing w:after="40" w:before="100"/>
+        <w:spacing w:after="36" w:before="80"/>
       </w:pPr>
       <w:r>
         <w:rPr>
@@ -857,7 +789,7 @@
         <w:pBdr>
           <w:bottom w:val="single" w:color="000000" w:sz="6"/>
         </w:pBdr>
-        <w:spacing w:after="40" w:before="100"/>
+        <w:spacing w:after="36" w:before="80"/>
       </w:pPr>
       <w:r>
         <w:rPr>
@@ -878,7 +810,7 @@
           <w:sz w:val="18"/>
           <w:szCs w:val="18"/>
         </w:rPr>
-        <w:t xml:space="preserve">SnowPro Core (in progress, exam scheduled Sep 2026) | Databricks Certified Data Engineer Associate (in progress) | Tableau Data Scientist (2020) | Snowflake Essentials (2023)</w:t>
+        <w:t xml:space="preserve">SnowPro Core (exam Sep 2026) | Databricks Data Engineer Associate (in progress) | Tableau Data Scientist (2020) | Snowflake Essentials (2023)</w:t>
       </w:r>
     </w:p>
     <w:sectPr>

</xml_diff>